<commit_message>
response validation for LLM, train LLM with E.G. for better answer
</commit_message>
<xml_diff>
--- a/New DOCX Document.docx
+++ b/New DOCX Document.docx
@@ -3124,8 +3124,6 @@
         </w:rPr>
         <w:t>Need to write this file while creating DB connection</w:t>
       </w:r>
-      <w:bookmarkStart w:id="0" w:name="_GoBack"/>
-      <w:bookmarkEnd w:id="0"/>
       <w:r>
         <w:rPr>
           <w:rFonts w:hint="default" w:ascii="Calibri" w:hAnsi="Calibri" w:cs="Calibri"/>
@@ -3179,8 +3177,25 @@
           <w:rFonts w:hint="default" w:ascii="Calibri" w:hAnsi="Calibri" w:cs="Calibri"/>
           <w:lang w:val="en-US"/>
         </w:rPr>
-        <w:t xml:space="preserve"> is called when we need to call an api that needs to interact with DB, only then we inherit it in function</w:t>
-      </w:r>
+        <w:t xml:space="preserve"> is called when we need to call an api that needs to interact with DB, only then we inherit it in function,</w:t>
+      </w:r>
+      <w:r>
+        <w:rPr>
+          <w:rFonts w:hint="default" w:ascii="Calibri" w:hAnsi="Calibri" w:cs="Calibri"/>
+          <w:lang w:val="en-US"/>
+        </w:rPr>
+        <w:br w:type="textWrapping"/>
+      </w:r>
+      <w:r>
+        <w:rPr>
+          <w:rFonts w:hint="default" w:ascii="Calibri" w:hAnsi="Calibri" w:cs="Calibri"/>
+          <w:lang w:val="en-US"/>
+        </w:rPr>
+        <w:tab/>
+        <w:t>await use korte gele aysnc use korte hoy</w:t>
+      </w:r>
+      <w:bookmarkStart w:id="0" w:name="_GoBack"/>
+      <w:bookmarkEnd w:id="0"/>
     </w:p>
     <w:sectPr>
       <w:pgSz w:w="11906" w:h="16838"/>
@@ -3445,7 +3460,7 @@
     <w:lsdException w:unhideWhenUsed="0" w:uiPriority="0" w:semiHidden="0" w:name="Body Text Indent 2"/>
     <w:lsdException w:unhideWhenUsed="0" w:uiPriority="0" w:semiHidden="0" w:name="Body Text Indent 3"/>
     <w:lsdException w:unhideWhenUsed="0" w:uiPriority="0" w:semiHidden="0" w:name="Block Text"/>
-    <w:lsdException w:unhideWhenUsed="0" w:uiPriority="0" w:semiHidden="0" w:name="Hyperlink"/>
+    <w:lsdException w:qFormat="1" w:unhideWhenUsed="0" w:uiPriority="0" w:semiHidden="0" w:name="Hyperlink"/>
     <w:lsdException w:unhideWhenUsed="0" w:uiPriority="0" w:semiHidden="0" w:name="FollowedHyperlink"/>
     <w:lsdException w:qFormat="1" w:unhideWhenUsed="0" w:uiPriority="0" w:semiHidden="0" w:name="Strong"/>
     <w:lsdException w:qFormat="1" w:unhideWhenUsed="0" w:uiPriority="0" w:semiHidden="0" w:name="Emphasis"/>
@@ -3735,6 +3750,7 @@
   <w:style w:type="character" w:styleId="9">
     <w:name w:val="Hyperlink"/>
     <w:basedOn w:val="4"/>
+    <w:qFormat/>
     <w:uiPriority w:val="0"/>
     <w:rPr>
       <w:color w:val="0000FF"/>

</xml_diff>